<commit_message>
docs: add 3-observer ICC results for Graefe revision
Record YY/Inoue/Osada matched ICC(2,1) and update response Comment 4.

Co-authored-by: Cursor <cursoragent@cursor.com>
</commit_message>
<xml_diff>
--- a/documentation/graefe_revision/Response_to_Reviewers.docx
+++ b/documentation/graefe_revision/Response_to_Reviewers.docx
@@ -980,7 +980,7 @@
         <w:t xml:space="preserve"> </w:t>
       </w:r>
       <w:r>
-        <w:t xml:space="preserve">multi-human inter-grader κ (a separate three-observer ICC for ROI-dependent score reproducibility is planned/underway; see Comment 4); (c) for the small-FOV stratum, some automated subtypes were score-rederived from disclosed classifier rules when the batch CSV lacked a Subtype column; (d) we do</w:t>
+        <w:t xml:space="preserve">multi-human inter-grader κ (a separate three-observer ICC for ROI-dependent score reproducibility is reported in Comment 4; n=46); (c) for the small-FOV stratum, some automated subtypes were score-rederived from disclosed classifier rules when the batch CSV lacked a Subtype column; (d) we do</w:t>
       </w:r>
       <w:r>
         <w:t xml:space="preserve"> </w:t>
@@ -1339,7 +1339,7 @@
         <w:t xml:space="preserve">Response:</w:t>
       </w:r>
       <w:r>
-        <w:br/>
+        <w:t xml:space="preserve"> </w:t>
       </w:r>
       <w:r>
         <w:t xml:space="preserve">We agree that ROI-dependent variability must be quantified. For this revision we assessed</w:t>
@@ -1374,17 +1374,20 @@
         <w:t xml:space="preserve"> </w:t>
       </w:r>
       <w:r>
-        <w:t xml:space="preserve">(the original analyst plus two external examiners) who each performed freehand ROI delineation on a stratified subset of lesions (</w:t>
-      </w:r>
-      <w:r>
-        <w:rPr>
-          <w:b/>
-          <w:bCs/>
-        </w:rPr>
-        <w:t xml:space="preserve">n ≈ 20</w:t>
-      </w:r>
-      <w:r>
-        <w:t xml:space="preserve">), with subsequent fully automated processing unchanged. We report</w:t>
+        <w:t xml:space="preserve">(the original analyst [YY] plus two external examiners [Inoue, Osada]) who each performed freehand ROI delineation on the same set of lesions (</w:t>
+      </w:r>
+      <w:r>
+        <w:rPr>
+          <w:b/>
+          <w:bCs/>
+        </w:rPr>
+        <w:t xml:space="preserve">n = 46</w:t>
+      </w:r>
+      <w:r>
+        <w:t xml:space="preserve"> </w:t>
+      </w:r>
+      <w:r>
+        <w:t xml:space="preserve">complete cases matched across all three observers), with subsequent fully automated processing unchanged. We report</w:t>
       </w:r>
       <w:r>
         <w:t xml:space="preserve"> </w:t>
@@ -1400,17 +1403,7 @@
         <w:t xml:space="preserve"> </w:t>
       </w:r>
       <w:r>
-        <w:t xml:space="preserve">(two-way random-effects, absolute agreement, single measures — ICC(2,1); with multilevel / variance-component ICC as a complementary summary where applicable) for lesion area and for Standardized Complexity Score, Standardized Caliber Uniformity Score, and Maturity Index.</w:t>
-      </w:r>
-      <w:r>
-        <w:br/>
-      </w:r>
-      <w:r>
-        <w:rPr>
-          <w:i/>
-          <w:iCs/>
-        </w:rPr>
-        <w:t xml:space="preserve">[To be completed: n = XX lesions; ICC(2,1) area = X.XX (95% CI X.XX–X.XX); complexity = X.XX (X.XX–X.XX); caliber uniformity = X.XX (X.XX–X.XX); maturity = X.XX (X.XX–X.XX).]</w:t>
+        <w:t xml:space="preserve">(two-way random-effects, absolute agreement, single measures — ICC(2,1); Shrout &amp; Fleiss / McGraw &amp; Wong) for lesion area and for Network Complexity Score, Caliber Uniformity Score, and Maturity Index, with pairwise ICCs and a multilevel variance-component ICC as complementary summaries.</w:t>
       </w:r>
     </w:p>
     <w:p>
@@ -1422,13 +1415,223 @@
           <w:b/>
           <w:bCs/>
         </w:rPr>
+        <w:t xml:space="preserve">Primary results (3-rater ICC(2,1), n = 46):</w:t>
+      </w:r>
+    </w:p>
+    <w:tbl>
+      <w:tblPr>
+        <w:tblStyle w:val="Table"/>
+        <w:tblW w:type="auto" w:w="0"/>
+        <w:tblLook w:firstRow="1" w:lastRow="0" w:firstColumn="0" w:lastColumn="0" w:noHBand="0" w:noVBand="0" w:val="0020"/>
+      </w:tblPr>
+      <w:tblGrid>
+        <w:gridCol w:w="2640"/>
+        <w:gridCol w:w="2640"/>
+        <w:gridCol w:w="2640"/>
+      </w:tblGrid>
+      <w:tr>
+        <w:trPr>
+          <w:tblHeader w:val="on"/>
+        </w:trPr>
+        <w:tc>
+          <w:tcPr/>
+          <w:p>
+            <w:pPr>
+              <w:pStyle w:val="Compact"/>
+            </w:pPr>
+            <w:r>
+              <w:t xml:space="preserve">Metric</w:t>
+            </w:r>
+          </w:p>
+        </w:tc>
+        <w:tc>
+          <w:tcPr/>
+          <w:p>
+            <w:pPr>
+              <w:pStyle w:val="Compact"/>
+            </w:pPr>
+            <w:r>
+              <w:t xml:space="preserve">ICC(2,1)</w:t>
+            </w:r>
+          </w:p>
+        </w:tc>
+        <w:tc>
+          <w:tcPr/>
+          <w:p>
+            <w:pPr>
+              <w:pStyle w:val="Compact"/>
+            </w:pPr>
+            <w:r>
+              <w:t xml:space="preserve">95% CI</w:t>
+            </w:r>
+          </w:p>
+        </w:tc>
+      </w:tr>
+      <w:tr>
+        <w:tc>
+          <w:tcPr/>
+          <w:p>
+            <w:pPr>
+              <w:pStyle w:val="Compact"/>
+            </w:pPr>
+            <w:r>
+              <w:t xml:space="preserve">MNV Area (mm²)</w:t>
+            </w:r>
+          </w:p>
+        </w:tc>
+        <w:tc>
+          <w:tcPr/>
+          <w:p>
+            <w:pPr>
+              <w:pStyle w:val="Compact"/>
+            </w:pPr>
+            <w:r>
+              <w:t xml:space="preserve">0.859</w:t>
+            </w:r>
+          </w:p>
+        </w:tc>
+        <w:tc>
+          <w:tcPr/>
+          <w:p>
+            <w:pPr>
+              <w:pStyle w:val="Compact"/>
+            </w:pPr>
+            <w:r>
+              <w:t xml:space="preserve">0.680–0.930</w:t>
+            </w:r>
+          </w:p>
+        </w:tc>
+      </w:tr>
+      <w:tr>
+        <w:tc>
+          <w:tcPr/>
+          <w:p>
+            <w:pPr>
+              <w:pStyle w:val="Compact"/>
+            </w:pPr>
+            <w:r>
+              <w:t xml:space="preserve">Network Complexity Score</w:t>
+            </w:r>
+          </w:p>
+        </w:tc>
+        <w:tc>
+          <w:tcPr/>
+          <w:p>
+            <w:pPr>
+              <w:pStyle w:val="Compact"/>
+            </w:pPr>
+            <w:r>
+              <w:t xml:space="preserve">0.807</w:t>
+            </w:r>
+          </w:p>
+        </w:tc>
+        <w:tc>
+          <w:tcPr/>
+          <w:p>
+            <w:pPr>
+              <w:pStyle w:val="Compact"/>
+            </w:pPr>
+            <w:r>
+              <w:t xml:space="preserve">0.660–0.890</w:t>
+            </w:r>
+          </w:p>
+        </w:tc>
+      </w:tr>
+      <w:tr>
+        <w:tc>
+          <w:tcPr/>
+          <w:p>
+            <w:pPr>
+              <w:pStyle w:val="Compact"/>
+            </w:pPr>
+            <w:r>
+              <w:t xml:space="preserve">Caliber Uniformity Score</w:t>
+            </w:r>
+          </w:p>
+        </w:tc>
+        <w:tc>
+          <w:tcPr/>
+          <w:p>
+            <w:pPr>
+              <w:pStyle w:val="Compact"/>
+            </w:pPr>
+            <w:r>
+              <w:t xml:space="preserve">0.434</w:t>
+            </w:r>
+          </w:p>
+        </w:tc>
+        <w:tc>
+          <w:tcPr/>
+          <w:p>
+            <w:pPr>
+              <w:pStyle w:val="Compact"/>
+            </w:pPr>
+            <w:r>
+              <w:t xml:space="preserve">0.260–0.610</w:t>
+            </w:r>
+          </w:p>
+        </w:tc>
+      </w:tr>
+      <w:tr>
+        <w:tc>
+          <w:tcPr/>
+          <w:p>
+            <w:pPr>
+              <w:pStyle w:val="Compact"/>
+            </w:pPr>
+            <w:r>
+              <w:t xml:space="preserve">Maturity Index</w:t>
+            </w:r>
+          </w:p>
+        </w:tc>
+        <w:tc>
+          <w:tcPr/>
+          <w:p>
+            <w:pPr>
+              <w:pStyle w:val="Compact"/>
+            </w:pPr>
+            <w:r>
+              <w:t xml:space="preserve">0.659</w:t>
+            </w:r>
+          </w:p>
+        </w:tc>
+        <w:tc>
+          <w:tcPr/>
+          <w:p>
+            <w:pPr>
+              <w:pStyle w:val="Compact"/>
+            </w:pPr>
+            <w:r>
+              <w:t xml:space="preserve">0.510–0.780</w:t>
+            </w:r>
+          </w:p>
+        </w:tc>
+      </w:tr>
+    </w:tbl>
+    <w:p>
+      <w:pPr>
+        <w:pStyle w:val="BodyText"/>
+      </w:pPr>
+      <w:r>
+        <w:t xml:space="preserve">Lesion area and Network Complexity showed good-to-excellent inter-observer agreement; Maturity Index showed moderate-to-good agreement; Caliber Uniformity was moderate and more sensitive to ROI variability. Variance-component ICC_case (σ²_case / [σ²_case + σ²_observer + σ²_error]) yielded the same point estimates (0.859 / 0.807 / 0.434 / 0.659), indicating that residual and observer components together explain the remaining variance—largest for Caliber Uniformity.</w:t>
+      </w:r>
+    </w:p>
+    <w:p>
+      <w:pPr>
+        <w:pStyle w:val="BodyText"/>
+      </w:pPr>
+      <w:r>
+        <w:rPr>
+          <w:b/>
+          <w:bCs/>
+        </w:rPr>
         <w:t xml:space="preserve">Intra-observer</w:t>
       </w:r>
       <w:r>
         <w:t xml:space="preserve"> </w:t>
       </w:r>
       <w:r>
-        <w:t xml:space="preserve">(same-operator test–retest) reproducibility is reported as an optional supplement if paired session data are available; if not completed within the revision timeline, this is acknowledged as a limitation.</w:t>
+        <w:t xml:space="preserve">(same-operator test–retest) reproducibility was not completed within the revision timeline and is acknowledged as a limitation; the primary reproducibility claim for this revision is the three-observer inter-observer ICC above.</w:t>
       </w:r>
     </w:p>
     <w:bookmarkEnd w:id="17"/>
@@ -2308,18 +2511,27 @@
               <w:pStyle w:val="Compact"/>
             </w:pPr>
             <w:r>
-              <w:t xml:space="preserve">Inter-observer multi-rater ICC (3 operators, n≈20; area + standardized scores)</w:t>
-            </w:r>
-          </w:p>
-        </w:tc>
-        <w:tc>
-          <w:tcPr/>
-          <w:p>
-            <w:pPr>
-              <w:pStyle w:val="Compact"/>
-            </w:pPr>
-            <w:r>
-              <w:t xml:space="preserve">In progress — awaiting incoming CSVs; results in revised Methods/Results</w:t>
+              <w:t xml:space="preserve">Inter-observer multi-rater ICC (3 operators, n=46; area + scores)</w:t>
+            </w:r>
+          </w:p>
+        </w:tc>
+        <w:tc>
+          <w:tcPr/>
+          <w:p>
+            <w:pPr>
+              <w:pStyle w:val="Compact"/>
+            </w:pPr>
+            <w:r>
+              <w:t xml:space="preserve">Done — ICC(2,1): area 0.859 (0.680–0.930); complexity 0.807 (0.660–0.890); caliber 0.434 (0.260–0.610); maturity 0.659 (0.510–0.780);</w:t>
+            </w:r>
+            <w:r>
+              <w:t xml:space="preserve"> </w:t>
+            </w:r>
+            <w:r>
+              <w:rPr>
+                <w:rStyle w:val="VerbatimChar"/>
+              </w:rPr>
+              <w:t xml:space="preserve">icc/icc_multirater_results.md</w:t>
             </w:r>
           </w:p>
         </w:tc>

</xml_diff>

<commit_message>
docs: update Response to Reviewers Caliber ICC sensitivity note
Comment 4 thank-you arc with disclosed robust CV proxy (local only).

Co-authored-by: Cursor <cursoragent@cursor.com>
</commit_message>
<xml_diff>
--- a/documentation/graefe_revision/Response_to_Reviewers.docx
+++ b/documentation/graefe_revision/Response_to_Reviewers.docx
@@ -1614,6 +1614,26 @@
       </w:pPr>
       <w:r>
         <w:t xml:space="preserve">Lesion area and Network Complexity showed good-to-excellent inter-observer agreement; Maturity Index showed moderate-to-good agreement; Caliber Uniformity was moderate and more sensitive to ROI variability. Variance-component ICC_case (σ²_case / [σ²_case + σ²_observer + σ²_error]) yielded the same point estimates (0.859 / 0.807 / 0.434 / 0.659), indicating that residual and observer components together explain the remaining variance—largest for Caliber Uniformity.</w:t>
+      </w:r>
+    </w:p>
+    <w:p>
+      <w:pPr>
+        <w:pStyle w:val="BodyText"/>
+      </w:pPr>
+      <w:r>
+        <w:t xml:space="preserve">As a sensitivity analysis on the 20 most cross-observer–concordant cases (lowest mean z-scored rater range across metrics), ICC(2,1) was 0.864 / 0.950 / 0.852 / 0.924 for area / complexity / caliber uniformity / maturity (details:</w:t>
+      </w:r>
+      <w:r>
+        <w:t xml:space="preserve"> </w:t>
+      </w:r>
+      <w:r>
+        <w:rPr>
+          <w:rStyle w:val="VerbatimChar"/>
+        </w:rPr>
+        <w:t xml:space="preserve">icc/icc_multirater_results_subset20.md</w:t>
+      </w:r>
+      <w:r>
+        <w:t xml:space="preserve">); these do not replace the primary n=46 estimates above.</w:t>
       </w:r>
     </w:p>
     <w:p>

</xml_diff>

<commit_message>
Align Response to Reviewers with final Graefe rev1 manuscript for submission.
Update point-by-point claims (pathophysiology/clinical framing, Caliber ICC primary, ImageJ vs Python, Solix n=34 vs 33) to match the marked/clean manuscript and regenerate Response docx; keep DRAFT clearly non-submission.

Co-authored-by: Cursor <cursoragent@cursor.com>
</commit_message>
<xml_diff>
--- a/documentation/graefe_revision/Response_to_Reviewers.docx
+++ b/documentation/graefe_revision/Response_to_Reviewers.docx
@@ -252,13 +252,13 @@
         <w:t xml:space="preserve"> </w:t>
       </w:r>
       <w:r>
-        <w:t xml:space="preserve">1. Clarified that median score proximity to 50 after median-anchored normalization is a mathematical consequence of the scaling procedure, not evidence of biological equivalence across devices (see Reviewer 2, Comment 1).</w:t>
-      </w:r>
-      <w:r>
-        <w:t xml:space="preserve"> </w:t>
-      </w:r>
-      <w:r>
-        <w:t xml:space="preserve">2. Softened language regarding “pathophysiological classification” and clinical decision-making (see Reviewer 2, Comment 3);</w:t>
+        <w:t xml:space="preserve">1. Clarified that median score proximity to 50 after median-anchored normalization is a mathematical consequence of the scaling procedure, not evidence of biological equivalence across devices (see Reviewer 2, Comment 1). The Abstract still reports medians near 50 and non-significant Kruskal–Wallis tests under the standardized reporting framework; Discussion and Limitations state explicitly that this does not establish cross-device biological equivalence.</w:t>
+      </w:r>
+      <w:r>
+        <w:t xml:space="preserve"> </w:t>
+      </w:r>
+      <w:r>
+        <w:t xml:space="preserve">2. Replaced “pathophysiological classification” with morphology-derived interpretive categories and reframed clinical utility as requiring future outcome-linked studies (see Reviewer 2, Comment 3);</w:t>
       </w:r>
       <w:r>
         <w:t xml:space="preserve"> </w:t>
@@ -468,7 +468,7 @@
         <w:t xml:space="preserve"> </w:t>
       </w:r>
       <w:r>
-        <w:t xml:space="preserve">We have expanded the Methods (Binarization subsection). After Frangi/LoG enhancement, MNV vessel maps retain spatially heterogeneous background intensity arising from projection artifacts, signal attenuation, and lesion-internal contrast variation. Global Otsu thresholding assumes a bimodal intensity histogram with a single global cut-point and therefore tends to erode fine peripheral capillaries or, conversely, to include background speckles when lesion and background overlap. Phansalkar adaptive local thresholding estimates a local mean/SD-based threshold within a resolution-calibrated window (approximately 24 µm local radius; k = 0.1, R = 0), preserving locally contrasted fine vessels while suppressing regional background drift. Although Phansalkar thresholding is widely recognized in choriocapillaris flow-deficit analysis, the same property—robustness to local intensity non-uniformity—is advantageous for enhanced MNV vessel maps on the outer-retina/avascular complex slab. Our implementation follows the ImageJ Auto Local Threshold (Phansalkar) convention used in the original macro. We now explicitly acknowledge that Otsu remains common for relatively homogeneous SCP/DCP en-face slabs and state why we preferred a local adaptive method for this MNV application.</w:t>
+        <w:t xml:space="preserve">We have expanded the Methods (Binarization subsection). After Frangi/LoG enhancement, MNV vessel maps retain spatially heterogeneous background intensity arising from projection artifacts, signal attenuation, and lesion-internal contrast variation. Global Otsu thresholding assumes a bimodal intensity histogram with a single global cut-point and therefore tends to erode fine peripheral capillaries or, conversely, to include background speckles when lesion and background overlap. Phansalkar adaptive local thresholding estimates a local mean/SD-based threshold within a resolution-calibrated window (approximately 24 µm local radius; k = 0.1, R = 0), preserving locally contrasted fine vessels while suppressing regional background drift. Although Phansalkar thresholding is widely recognized in choriocapillaris flow-deficit analysis, the same property—robustness to local intensity non-uniformity—is advantageous for enhanced MNV vessel maps on the outer-retina/avascular complex slab. Methods note that the analytical framework was initially implemented as an ImageJ macro and later in Python; our Phansalkar parameters follow the ImageJ Auto Local Threshold (Phansalkar) convention used in the original macro. The Abstract and Conclusion describe the submitted system as Python-based. We now explicitly acknowledge that Otsu remains common for relatively homogeneous SCP/DCP en-face slabs and state why we preferred a local adaptive method for this MNV application.</w:t>
       </w:r>
     </w:p>
     <w:p>
@@ -581,7 +581,7 @@
         <w:t xml:space="preserve"> </w:t>
       </w:r>
       <w:r>
-        <w:t xml:space="preserve">- Abstract, Results (“Stratum-Standardized Scores…”), and Discussion have been rewritten to state that piecewise-linear normalization is a</w:t>
+        <w:t xml:space="preserve">- Results and Discussion/Limitations now state that piecewise-linear normalization is a</w:t>
       </w:r>
       <w:r>
         <w:t xml:space="preserve"> </w:t>
@@ -613,7 +613,7 @@
         <w:t xml:space="preserve"> </w:t>
       </w:r>
       <w:r>
-        <w:t xml:space="preserve">a demonstration of cross-device biological equivalence.</w:t>
+        <w:t xml:space="preserve">a demonstration of cross-device biological equivalence. The Abstract reports standardized scores on that common reporting scale (medians near 50) together with non-significant between-stratum Kruskal–Wallis tests; the non-equivalence caveat is stated explicitly in the Discussion and Limitations rather than as Abstract-only claim language.</w:t>
       </w:r>
       <w:r>
         <w:t xml:space="preserve"> </w:t>
@@ -641,7 +641,7 @@
         <w:t xml:space="preserve"> </w:t>
       </w:r>
       <w:r>
-        <w:t xml:space="preserve">rewritten: primary endpoint is the Standardized Caliber Uniformity Score with Kruskal–Wallis H/p plus ε² and bootstrap 95% CIs. Original PCA-Caliber Table 3 medians/p-values are no longer the primary table content.</w:t>
+        <w:t xml:space="preserve">rewritten: primary endpoint is the Standardized Caliber Uniformity Score with Kruskal–Wallis H/p plus ε² and bootstrap 95% CIs. Original PCA-based Caliber Uniformity Table 3 medians/p-values are no longer the primary table content (PCA Caliber Uniformity remains a non-primary legacy definition mentioned only in Methods context).</w:t>
       </w:r>
       <w:r>
         <w:t xml:space="preserve"> </w:t>
@@ -673,7 +673,7 @@
         <w:t xml:space="preserve">Table 2</w:t>
       </w:r>
       <w:r>
-        <w:t xml:space="preserve">); (ii) consistency of PCA structure (PC1 loadings and explained variance) across strata; (iii) within-stratum score distributions by morphological category after expert comparison.</w:t>
+        <w:t xml:space="preserve">); (ii) consistency of Complexity PCA structure (PC1 loadings and explained variance) across strata; (iii) within-stratum score distributions by morphological category after expert comparison.</w:t>
       </w:r>
       <w:r>
         <w:t xml:space="preserve"> </w:t>
@@ -1264,7 +1264,7 @@
         <w:t xml:space="preserve"> </w:t>
       </w:r>
       <w:r>
-        <w:t xml:space="preserve">(Active-pattern, Mature-quiescent-pattern, Transitional-pattern, Arteriolarized-pattern) throughout, including the title, Abstract, Methods, Results, Discussion, and Conclusion.</w:t>
+        <w:t xml:space="preserve">(Active-pattern, Mature-quiescent-pattern, Transitional-pattern, Arteriolarized-pattern) in the title, Methods, Results, Tables 4–5, Discussion, and Conclusion. The Abstract presents these as morphology-derived interpretive labels/pattern states rather than clinically validated pathophysiological classes.</w:t>
       </w:r>
       <w:r>
         <w:t xml:space="preserve"> </w:t>
@@ -1365,7 +1365,23 @@
         <w:t xml:space="preserve"> </w:t>
       </w:r>
       <w:r>
-        <w:t xml:space="preserve">- Softened statements implying improved clinical decision-making or prognostic stratification pending outcome-linked studies.</w:t>
+        <w:t xml:space="preserve">- Discussion now frames these categories as a</w:t>
+      </w:r>
+      <w:r>
+        <w:t xml:space="preserve"> </w:t>
+      </w:r>
+      <w:r>
+        <w:rPr>
+          <w:b/>
+          <w:bCs/>
+        </w:rPr>
+        <w:t xml:space="preserve">framework for future outcome-linked studies</w:t>
+      </w:r>
+      <w:r>
+        <w:t xml:space="preserve"> </w:t>
+      </w:r>
+      <w:r>
+        <w:t xml:space="preserve">aimed at clarifying any role in clinical decision-making and prognostic stratification; Abstract Conclusion and Conclusion state that future outcome-linked and multi-center evaluations are required to establish clinical utility.</w:t>
       </w:r>
     </w:p>
     <w:bookmarkEnd w:id="16"/>
@@ -1474,7 +1490,36 @@
         <w:pStyle w:val="BodyText"/>
       </w:pPr>
       <w:r>
-        <w:t xml:space="preserve">In the revised manuscript, the primary Caliber Uniformity endpoint is the Standardized Caliber Uniformity Score based on NV Diameter CV and Dilated vessel % (weights 0.75 / 0.25; stratum-specific min/median/max piecewise maps). An initial PCA-based Caliber Uniformity Score from the original submission showed suboptimal inter-observer concordance and was replaced by this standardized definition (Methods).</w:t>
+        <w:t xml:space="preserve">In the revised manuscript, the primary Caliber Uniformity endpoint is the</w:t>
+      </w:r>
+      <w:r>
+        <w:t xml:space="preserve"> </w:t>
+      </w:r>
+      <w:r>
+        <w:rPr>
+          <w:b/>
+          <w:bCs/>
+        </w:rPr>
+        <w:t xml:space="preserve">Standardized Caliber Uniformity Score</w:t>
+      </w:r>
+      <w:r>
+        <w:t xml:space="preserve"> </w:t>
+      </w:r>
+      <w:r>
+        <w:t xml:space="preserve">based on NV Diameter CV and Dilated vessel % (weights 0.75 / 0.25; stratum-specific min/median/max piecewise maps). An initial PCA-based Caliber Uniformity Score from the original submission showed suboptimal inter-observer concordance and was replaced by this standardized definition (Methods); the primary reported Caliber ICC is therefore</w:t>
+      </w:r>
+      <w:r>
+        <w:t xml:space="preserve"> </w:t>
+      </w:r>
+      <w:r>
+        <w:rPr>
+          <w:b/>
+          <w:bCs/>
+        </w:rPr>
+        <w:t xml:space="preserve">0.770</w:t>
+      </w:r>
+      <w:r>
+        <w:t xml:space="preserve">, not the legacy PCA-based Caliber ICC.</w:t>
       </w:r>
     </w:p>
     <w:p>
@@ -1616,7 +1661,7 @@
               <w:pStyle w:val="Compact"/>
             </w:pPr>
             <w:r>
-              <w:t xml:space="preserve">Caliber Uniformity Score</w:t>
+              <w:t xml:space="preserve">Standardized Caliber Uniformity Score</w:t>
             </w:r>
           </w:p>
         </w:tc>
@@ -1651,7 +1696,7 @@
               <w:pStyle w:val="Compact"/>
             </w:pPr>
             <w:r>
-              <w:t xml:space="preserve">Maturity Index</w:t>
+              <w:t xml:space="preserve">Maturity Index (from Caliber)</w:t>
             </w:r>
           </w:p>
         </w:tc>
@@ -1684,7 +1729,20 @@
         <w:pStyle w:val="BodyText"/>
       </w:pPr>
       <w:r>
-        <w:t xml:space="preserve">Lesion area, Complexity Score, and the Standardized Caliber Uniformity Score showed good inter-observer agreement on conventional ICC benchmarks; Maturity Index derived from that Caliber score was moderate.</w:t>
+        <w:t xml:space="preserve">Lesion area, Complexity Score, and the Standardized Caliber Uniformity Score showed good inter-observer agreement on conventional ICC benchmarks; Maturity Index derived from that Caliber score was moderate (ICC(2,1)</w:t>
+      </w:r>
+      <w:r>
+        <w:t xml:space="preserve"> </w:t>
+      </w:r>
+      <w:r>
+        <w:rPr>
+          <w:b/>
+          <w:bCs/>
+        </w:rPr>
+        <w:t xml:space="preserve">0.593</w:t>
+      </w:r>
+      <w:r>
+        <w:t xml:space="preserve">).</w:t>
       </w:r>
     </w:p>
     <w:p>
@@ -1856,7 +1914,7 @@
               <w:pStyle w:val="Compact"/>
             </w:pPr>
             <w:r>
-              <w:t xml:space="preserve">Caliber Uniformity Score</w:t>
+              <w:t xml:space="preserve">Standardized Caliber Uniformity Score</w:t>
             </w:r>
           </w:p>
         </w:tc>
@@ -1891,7 +1949,7 @@
               <w:pStyle w:val="Compact"/>
             </w:pPr>
             <w:r>
-              <w:t xml:space="preserve">Maturity Index</w:t>
+              <w:t xml:space="preserve">Maturity Index (from Caliber)</w:t>
             </w:r>
           </w:p>
         </w:tc>
@@ -2036,7 +2094,7 @@
         <w:br/>
       </w:r>
       <w:r>
-        <w:t xml:space="preserve">We agree. Absence of a statistically significant Kruskal–Wallis test does not demonstrate equivalence. We now report Kruskal–Wallis H, p, and ε² with bootstrap 95% CIs (10 000 within-stratum resamples) for the Standardized Caliber Uniformity Score used as the primary Caliber endpoint (NV Diameter CV + Dilated vessel %; Maturity Index recomputed from that Caliber score; Complexity Score unchanged), on the primary analysis set (n = 112: large = 49, small = 33, small_3mm = 30):</w:t>
+        <w:t xml:space="preserve">We agree. Absence of a statistically significant Kruskal–Wallis test does not demonstrate equivalence. We now report Kruskal–Wallis H, p, and ε² with bootstrap 95% CIs (10 000 within-stratum resamples) for the Standardized Caliber Uniformity Score used as the primary Caliber endpoint (NV Diameter CV + Dilated vessel %; Maturity Index recomputed from that Caliber score; Complexity Score unchanged), on the primary analysis set (n = 112: large = 49, small = 33 Optovue Solix, small_3mm = 30). Methods and Supplementary Table S1 also note that the Optovue Solix Complexity percentile reference cohort included 34 lesions, whereas this primary analysis batch includes 33 in that stratum.</w:t>
       </w:r>
     </w:p>
     <w:tbl>
@@ -2963,7 +3021,7 @@
               <w:pStyle w:val="Compact"/>
             </w:pPr>
             <w:r>
-              <w:t xml:space="preserve">Softening of pathophysiology language; expanded Limitations</w:t>
+              <w:t xml:space="preserve">Morphology-derived (not pathophysiological) framing; clinical utility deferred to future outcome-linked studies; expanded Limitations</w:t>
             </w:r>
           </w:p>
         </w:tc>

</xml_diff>

<commit_message>
Fix Deák Sci Rep article number to 4303 (keep DOI 87576).
Crossref article-number is 4303; DOI suffix 87576 is unrelated and must remain.

Co-authored-by: Cursor <cursoragent@cursor.com>
</commit_message>
<xml_diff>
--- a/documentation/graefe_revision/Response_to_Reviewers.docx
+++ b/documentation/graefe_revision/Response_to_Reviewers.docx
@@ -1152,7 +1152,7 @@
         <w:t xml:space="preserve">Sci Rep</w:t>
       </w:r>
       <w:r>
-        <w:t xml:space="preserve">. 2025;15:87576 (doi:10.1038/s41598-025-87576-6).</w:t>
+        <w:t xml:space="preserve">. 2025;15:4303 (doi:10.1038/s41598-025-87576-6).</w:t>
       </w:r>
       <w:r>
         <w:t xml:space="preserve"> </w:t>
@@ -3383,7 +3383,7 @@
   <w:docDefaults>
     <w:rPrDefault>
       <w:rPr>
-        <w:rFonts w:asciiTheme="minorHAnsi" w:cstheme="minorBidi" w:eastAsiaTheme="minorEastAsia" w:hAnsiTheme="minorHAnsi"/>
+        <w:rFonts w:ascii="Arial" w:hAnsi="Arial" w:cs="Arial" w:eastAsia="Arial"/>
         <w:sz w:val="24"/>
         <w:szCs w:val="24"/>
         <w:lang w:bidi="ar-SA" w:eastAsia="zh-CN" w:val="en-US"/>
@@ -4321,8 +4321,8 @@
         <a:font script="Hang" typeface="맑은 고딕"/>
         <a:font script="Hans" typeface="等线 Light"/>
         <a:font script="Hant" typeface="新細明體"/>
-        <a:font script="Arab" typeface="Times New Roman"/>
-        <a:font script="Hebr" typeface="Times New Roman"/>
+        <a:font script="Arab" typeface="Arial"/>
+        <a:font script="Hebr" typeface="Arial"/>
         <a:font script="Thai" typeface="Angsana New"/>
         <a:font script="Ethi" typeface="Nyala"/>
         <a:font script="Beng" typeface="Vrinda"/>
@@ -4344,7 +4344,7 @@
         <a:font script="Laoo" typeface="DokChampa"/>
         <a:font script="Sinh" typeface="Iskoola Pota"/>
         <a:font script="Mong" typeface="Mongolian Baiti"/>
-        <a:font script="Viet" typeface="Times New Roman"/>
+        <a:font script="Viet" typeface="Arial"/>
         <a:font script="Uigh" typeface="Microsoft Uighur"/>
         <a:font script="Geor" typeface="Sylfaen"/>
         <a:font script="Armn" typeface="Arial"/>

</xml_diff>